<commit_message>
FASE 6-ter - template sterilizzati: fix run XML frammentati per docxtemplater
</commit_message>
<xml_diff>
--- a/templates/verbale_sopralluogo.docx
+++ b/templates/verbale_sopralluogo.docx
@@ -108,14 +108,7 @@
             </w:pPr>
             <w:r>
               <w:rPr/>
-              <w:t>{data_sopralluogo</w:t>
-            </w:r>
-            <w:r>
-              <w:rPr>
-                <w:sz w:val="22"/>
-                <w:szCs w:val="22"/>
-              </w:rPr>
-              <w:t>}</w:t>
+              <w:t xml:space="preserve">{data_sopralluogo}</w:t>
             </w:r>
           </w:p>
         </w:tc>
@@ -2183,18 +2176,7 @@
               <w:szCs w:val="20"/>
               <w:shd w:fill="FFFFFF" w:val="clear"/>
             </w:rPr>
-            <w:t>{</w:t>
-          </w:r>
-          <w:r>
-            <w:rPr>
-              <w:rStyle w:val="normaltextrun"/>
-              <w:rFonts w:cs="Open Sans Light" w:ascii="Open Sans Light" w:hAnsi="Open Sans Light"/>
-              <w:color w:val="000000"/>
-              <w:sz w:val="20"/>
-              <w:szCs w:val="20"/>
-              <w:shd w:fill="FFFFFF" w:val="clear"/>
-            </w:rPr>
-            <w:t>modulo_codice}</w:t>
+            <w:t xml:space="preserve">{modulo_codice}</w:t>
           </w:r>
         </w:p>
       </w:tc>
@@ -2317,18 +2299,7 @@
               <w:szCs w:val="20"/>
               <w:shd w:fill="FFFFFF" w:val="clear"/>
             </w:rPr>
-            <w:t>{</w:t>
-          </w:r>
-          <w:r>
-            <w:rPr>
-              <w:rStyle w:val="normaltextrun"/>
-              <w:rFonts w:cs="Open Sans Light" w:ascii="Open Sans Light" w:hAnsi="Open Sans Light"/>
-              <w:color w:val="000000"/>
-              <w:sz w:val="20"/>
-              <w:szCs w:val="20"/>
-              <w:shd w:fill="FFFFFF" w:val="clear"/>
-            </w:rPr>
-            <w:t>modulo_versione}</w:t>
+            <w:t xml:space="preserve">{modulo_versione}</w:t>
           </w:r>
         </w:p>
       </w:tc>
@@ -2593,18 +2564,7 @@
               <w:szCs w:val="20"/>
               <w:shd w:fill="FFFFFF" w:val="clear"/>
             </w:rPr>
-            <w:t>{</w:t>
-          </w:r>
-          <w:r>
-            <w:rPr>
-              <w:rStyle w:val="normaltextrun"/>
-              <w:rFonts w:cs="Open Sans Light" w:ascii="Open Sans Light" w:hAnsi="Open Sans Light"/>
-              <w:color w:val="000000"/>
-              <w:sz w:val="20"/>
-              <w:szCs w:val="20"/>
-              <w:shd w:fill="FFFFFF" w:val="clear"/>
-            </w:rPr>
-            <w:t>modulo_codice}</w:t>
+            <w:t xml:space="preserve">{modulo_codice}</w:t>
           </w:r>
         </w:p>
       </w:tc>
@@ -2727,18 +2687,7 @@
               <w:szCs w:val="20"/>
               <w:shd w:fill="FFFFFF" w:val="clear"/>
             </w:rPr>
-            <w:t>{</w:t>
-          </w:r>
-          <w:r>
-            <w:rPr>
-              <w:rStyle w:val="normaltextrun"/>
-              <w:rFonts w:cs="Open Sans Light" w:ascii="Open Sans Light" w:hAnsi="Open Sans Light"/>
-              <w:color w:val="000000"/>
-              <w:sz w:val="20"/>
-              <w:szCs w:val="20"/>
-              <w:shd w:fill="FFFFFF" w:val="clear"/>
-            </w:rPr>
-            <w:t>modulo_versione}</w:t>
+            <w:t xml:space="preserve">{modulo_versione}</w:t>
           </w:r>
         </w:p>
       </w:tc>

</xml_diff>

<commit_message>
fix: sostituisci template con versioni sterilizzate (run XML non frammentati)
I 3 template in templates/ avevano tag {{header_destro}}, {{modulo_codice}} ecc.
spezzati in più <w:t> consecutivi in word/header1.xml.
Su GitHub Pages ciò causava "Duplicate open tag / Duplicate close tag" da docxtemplater.
Sostituiti con le versioni corrette da backup/ (run XML già ricuciti).

Co-Authored-By: Claude Sonnet 4.6 <noreply@anthropic.com>
</commit_message>
<xml_diff>
--- a/templates/verbale_sopralluogo.docx
+++ b/templates/verbale_sopralluogo.docx
@@ -108,7 +108,14 @@
             </w:pPr>
             <w:r>
               <w:rPr/>
-              <w:t xml:space="preserve">{data_sopralluogo}</w:t>
+              <w:t>{data_sopralluogo</w:t>
+            </w:r>
+            <w:r>
+              <w:rPr>
+                <w:sz w:val="22"/>
+                <w:szCs w:val="22"/>
+              </w:rPr>
+              <w:t>}</w:t>
             </w:r>
           </w:p>
         </w:tc>
@@ -2176,7 +2183,18 @@
               <w:szCs w:val="20"/>
               <w:shd w:fill="FFFFFF" w:val="clear"/>
             </w:rPr>
-            <w:t xml:space="preserve">{modulo_codice}</w:t>
+            <w:t>{</w:t>
+          </w:r>
+          <w:r>
+            <w:rPr>
+              <w:rStyle w:val="normaltextrun"/>
+              <w:rFonts w:cs="Open Sans Light" w:ascii="Open Sans Light" w:hAnsi="Open Sans Light"/>
+              <w:color w:val="000000"/>
+              <w:sz w:val="20"/>
+              <w:szCs w:val="20"/>
+              <w:shd w:fill="FFFFFF" w:val="clear"/>
+            </w:rPr>
+            <w:t>modulo_codice}</w:t>
           </w:r>
         </w:p>
       </w:tc>
@@ -2299,7 +2317,18 @@
               <w:szCs w:val="20"/>
               <w:shd w:fill="FFFFFF" w:val="clear"/>
             </w:rPr>
-            <w:t xml:space="preserve">{modulo_versione}</w:t>
+            <w:t>{</w:t>
+          </w:r>
+          <w:r>
+            <w:rPr>
+              <w:rStyle w:val="normaltextrun"/>
+              <w:rFonts w:cs="Open Sans Light" w:ascii="Open Sans Light" w:hAnsi="Open Sans Light"/>
+              <w:color w:val="000000"/>
+              <w:sz w:val="20"/>
+              <w:szCs w:val="20"/>
+              <w:shd w:fill="FFFFFF" w:val="clear"/>
+            </w:rPr>
+            <w:t>modulo_versione}</w:t>
           </w:r>
         </w:p>
       </w:tc>
@@ -2564,7 +2593,18 @@
               <w:szCs w:val="20"/>
               <w:shd w:fill="FFFFFF" w:val="clear"/>
             </w:rPr>
-            <w:t xml:space="preserve">{modulo_codice}</w:t>
+            <w:t>{</w:t>
+          </w:r>
+          <w:r>
+            <w:rPr>
+              <w:rStyle w:val="normaltextrun"/>
+              <w:rFonts w:cs="Open Sans Light" w:ascii="Open Sans Light" w:hAnsi="Open Sans Light"/>
+              <w:color w:val="000000"/>
+              <w:sz w:val="20"/>
+              <w:szCs w:val="20"/>
+              <w:shd w:fill="FFFFFF" w:val="clear"/>
+            </w:rPr>
+            <w:t>modulo_codice}</w:t>
           </w:r>
         </w:p>
       </w:tc>
@@ -2687,7 +2727,18 @@
               <w:szCs w:val="20"/>
               <w:shd w:fill="FFFFFF" w:val="clear"/>
             </w:rPr>
-            <w:t xml:space="preserve">{modulo_versione}</w:t>
+            <w:t>{</w:t>
+          </w:r>
+          <w:r>
+            <w:rPr>
+              <w:rStyle w:val="normaltextrun"/>
+              <w:rFonts w:cs="Open Sans Light" w:ascii="Open Sans Light" w:hAnsi="Open Sans Light"/>
+              <w:color w:val="000000"/>
+              <w:sz w:val="20"/>
+              <w:szCs w:val="20"/>
+              <w:shd w:fill="FFFFFF" w:val="clear"/>
+            </w:rPr>
+            <w:t>modulo_versione}</w:t>
           </w:r>
         </w:p>
       </w:tc>

</xml_diff>